<commit_message>
docs: update testing metrics with real app screenshots
</commit_message>
<xml_diff>
--- a/docs/testing-metrics/testing-report.docx
+++ b/docs/testing-metrics/testing-report.docx
@@ -1915,7 +1915,7 @@
           <w:color w:val="1F3864"/>
           <w:sz w:val="22"/>
         </w:rPr>
-        <w:t>Screenshot 1 – Hasil Eksekusi Jest (Semua Test PASS)</w:t>
+        <w:t>Screenshot 1 – Hasil Eksekusi Jest (15/15 PASS)</w:t>
       </w:r>
     </w:p>
     <w:p>
@@ -1925,7 +1925,7 @@
       <w:r>
         <w:drawing>
           <wp:inline xmlns:a="http://schemas.openxmlformats.org/drawingml/2006/main" xmlns:pic="http://schemas.openxmlformats.org/drawingml/2006/picture">
-            <wp:extent cx="5029200" cy="5029200"/>
+            <wp:extent cx="5029200" cy="2856841"/>
             <wp:docPr id="1" name="Picture 1"/>
             <wp:cNvGraphicFramePr>
               <a:graphicFrameLocks noChangeAspect="1"/>
@@ -1934,7 +1934,7 @@
               <a:graphicData uri="http://schemas.openxmlformats.org/drawingml/2006/picture">
                 <pic:pic>
                   <pic:nvPicPr>
-                    <pic:cNvPr id="0" name="ss1_jest_test_results.png"/>
+                    <pic:cNvPr id="0" name="real_ss_jest_cmd.png"/>
                     <pic:cNvPicPr/>
                   </pic:nvPicPr>
                   <pic:blipFill>
@@ -1946,7 +1946,7 @@
                   <pic:spPr>
                     <a:xfrm>
                       <a:off x="0" y="0"/>
-                      <a:ext cx="5029200" cy="5029200"/>
+                      <a:ext cx="5029200" cy="2856841"/>
                     </a:xfrm>
                     <a:prstGeom prst="rect"/>
                   </pic:spPr>
@@ -1966,7 +1966,7 @@
           <w:color w:val="505050"/>
           <w:sz w:val="20"/>
         </w:rPr>
-        <w:t>Menampilkan output terminal Jest dengan 15 test case yang semuanya PASS (✓) dalam waktu 11.889 detik. Tool: Jest v29 + Supertest v6.</w:t>
+        <w:t>Output Jest test suite: 15 test case PASS semua dalam waktu 12.042 detik. Dijalankan dengan perintah: npm test -- --verbose di direktori backend. Tool: Jest v29 + Supertest v6.</w:t>
       </w:r>
     </w:p>
     <w:p/>
@@ -1977,7 +1977,7 @@
           <w:color w:val="1F3864"/>
           <w:sz w:val="22"/>
         </w:rPr>
-        <w:t>Screenshot 2 – Halaman Login Aplikasi</w:t>
+        <w:t>Screenshot 2 – Halaman Seleksi (Landing Page)</w:t>
       </w:r>
     </w:p>
     <w:p>
@@ -1987,7 +1987,7 @@
       <w:r>
         <w:drawing>
           <wp:inline xmlns:a="http://schemas.openxmlformats.org/drawingml/2006/main" xmlns:pic="http://schemas.openxmlformats.org/drawingml/2006/picture">
-            <wp:extent cx="5029200" cy="5029200"/>
+            <wp:extent cx="5029200" cy="2803525"/>
             <wp:docPr id="2" name="Picture 2"/>
             <wp:cNvGraphicFramePr>
               <a:graphicFrameLocks noChangeAspect="1"/>
@@ -1996,7 +1996,7 @@
               <a:graphicData uri="http://schemas.openxmlformats.org/drawingml/2006/picture">
                 <pic:pic>
                   <pic:nvPicPr>
-                    <pic:cNvPr id="0" name="ss2_login_page.png"/>
+                    <pic:cNvPr id="0" name="real_ss1_selection.png"/>
                     <pic:cNvPicPr/>
                   </pic:nvPicPr>
                   <pic:blipFill>
@@ -2008,7 +2008,7 @@
                   <pic:spPr>
                     <a:xfrm>
                       <a:off x="0" y="0"/>
-                      <a:ext cx="5029200" cy="5029200"/>
+                      <a:ext cx="5029200" cy="2803525"/>
                     </a:xfrm>
                     <a:prstGeom prst="rect"/>
                   </pic:spPr>
@@ -2028,7 +2028,7 @@
           <w:color w:val="505050"/>
           <w:sz w:val="20"/>
         </w:rPr>
-        <w:t>Halaman login Sistem Pengelolaan Anggaran Iklan Digital. Form email dan password yang divalidasi di backend (TC-01 s/d TC-05).</w:t>
+        <w:t>Halaman utama aplikasi AdBudget Manager menampilkan dua pilihan akses: Portal Admin (Manajemen Perusahaan) dan Ruang Kerja Pengguna (Operasi Kampanye).</w:t>
       </w:r>
     </w:p>
     <w:p/>
@@ -2039,7 +2039,7 @@
           <w:color w:val="1F3864"/>
           <w:sz w:val="22"/>
         </w:rPr>
-        <w:t>Screenshot 3 – Dashboard Utama (User)</w:t>
+        <w:t>Screenshot 3 – Halaman Login Admin</w:t>
       </w:r>
     </w:p>
     <w:p>
@@ -2049,7 +2049,7 @@
       <w:r>
         <w:drawing>
           <wp:inline xmlns:a="http://schemas.openxmlformats.org/drawingml/2006/main" xmlns:pic="http://schemas.openxmlformats.org/drawingml/2006/picture">
-            <wp:extent cx="5029200" cy="5029200"/>
+            <wp:extent cx="5029200" cy="2803525"/>
             <wp:docPr id="3" name="Picture 3"/>
             <wp:cNvGraphicFramePr>
               <a:graphicFrameLocks noChangeAspect="1"/>
@@ -2058,7 +2058,7 @@
               <a:graphicData uri="http://schemas.openxmlformats.org/drawingml/2006/picture">
                 <pic:pic>
                   <pic:nvPicPr>
-                    <pic:cNvPr id="0" name="ss3_dashboard.png"/>
+                    <pic:cNvPr id="0" name="real_ss2_admin_login.png"/>
                     <pic:cNvPicPr/>
                   </pic:nvPicPr>
                   <pic:blipFill>
@@ -2070,7 +2070,7 @@
                   <pic:spPr>
                     <a:xfrm>
                       <a:off x="0" y="0"/>
-                      <a:ext cx="5029200" cy="5029200"/>
+                      <a:ext cx="5029200" cy="2803525"/>
                     </a:xfrm>
                     <a:prstGeom prst="rect"/>
                   </pic:spPr>
@@ -2090,7 +2090,7 @@
           <w:color w:val="505050"/>
           <w:sz w:val="20"/>
         </w:rPr>
-        <w:t>Dashboard user menampilkan ringkasan: sisa anggaran, total realisasi, dan daftar kampanye aktif. Endpoint /api/dashboard/summary diproteksi JWT (TC-14).</w:t>
+        <w:t>Form login Admin dengan field Email dan Kata Sandi. Diproteksi rate limiter (10 request/15 menit) untuk mencegah brute force attack (TC-01 s/d TC-05).</w:t>
       </w:r>
     </w:p>
     <w:p/>
@@ -2101,7 +2101,7 @@
           <w:color w:val="1F3864"/>
           <w:sz w:val="22"/>
         </w:rPr>
-        <w:t>Screenshot 4 – Halaman Manajemen Campaign</w:t>
+        <w:t>Screenshot 4 – Dashboard Admin (Dasbor Anggaran)</w:t>
       </w:r>
     </w:p>
     <w:p>
@@ -2111,7 +2111,7 @@
       <w:r>
         <w:drawing>
           <wp:inline xmlns:a="http://schemas.openxmlformats.org/drawingml/2006/main" xmlns:pic="http://schemas.openxmlformats.org/drawingml/2006/picture">
-            <wp:extent cx="5029200" cy="5029200"/>
+            <wp:extent cx="5029200" cy="2803525"/>
             <wp:docPr id="4" name="Picture 4"/>
             <wp:cNvGraphicFramePr>
               <a:graphicFrameLocks noChangeAspect="1"/>
@@ -2120,7 +2120,7 @@
               <a:graphicData uri="http://schemas.openxmlformats.org/drawingml/2006/picture">
                 <pic:pic>
                   <pic:nvPicPr>
-                    <pic:cNvPr id="0" name="ss4_campaign_management.png"/>
+                    <pic:cNvPr id="0" name="real_ss3_dashboard.png"/>
                     <pic:cNvPicPr/>
                   </pic:nvPicPr>
                   <pic:blipFill>
@@ -2132,7 +2132,7 @@
                   <pic:spPr>
                     <a:xfrm>
                       <a:off x="0" y="0"/>
-                      <a:ext cx="5029200" cy="5029200"/>
+                      <a:ext cx="5029200" cy="2803525"/>
                     </a:xfrm>
                     <a:prstGeom prst="rect"/>
                   </pic:spPr>
@@ -2152,7 +2152,7 @@
           <w:color w:val="505050"/>
           <w:sz w:val="20"/>
         </w:rPr>
-        <w:t>Halaman CRUD campaign dengan tabel data, tombol tambah, edit, dan hapus. Seluruh endpoint campaign memerlukan token autentikasi (TC-06 s/d TC-10).</w:t>
+        <w:t>Dashboard admin menampilkan: Total Anggaran Rp 3.400.121, Total Realisasi Rp 2.700.121, Total Revenue Rp 3.383.500, dan daftar kampanye aktif. Endpoint diproteksi JWT (TC-14).</w:t>
       </w:r>
     </w:p>
     <w:p/>
@@ -2163,7 +2163,7 @@
           <w:color w:val="1F3864"/>
           <w:sz w:val="22"/>
         </w:rPr>
-        <w:t>Screenshot 5 – Halaman Laporan Admin</w:t>
+        <w:t>Screenshot 5 – Halaman Manajemen Kampanye</w:t>
       </w:r>
     </w:p>
     <w:p>
@@ -2173,7 +2173,7 @@
       <w:r>
         <w:drawing>
           <wp:inline xmlns:a="http://schemas.openxmlformats.org/drawingml/2006/main" xmlns:pic="http://schemas.openxmlformats.org/drawingml/2006/picture">
-            <wp:extent cx="5029200" cy="5029200"/>
+            <wp:extent cx="5029200" cy="2803525"/>
             <wp:docPr id="5" name="Picture 5"/>
             <wp:cNvGraphicFramePr>
               <a:graphicFrameLocks noChangeAspect="1"/>
@@ -2182,7 +2182,7 @@
               <a:graphicData uri="http://schemas.openxmlformats.org/drawingml/2006/picture">
                 <pic:pic>
                   <pic:nvPicPr>
-                    <pic:cNvPr id="0" name="ss5_reports_page.png"/>
+                    <pic:cNvPr id="0" name="real_ss4_campaign.png"/>
                     <pic:cNvPicPr/>
                   </pic:nvPicPr>
                   <pic:blipFill>
@@ -2194,7 +2194,7 @@
                   <pic:spPr>
                     <a:xfrm>
                       <a:off x="0" y="0"/>
-                      <a:ext cx="5029200" cy="5029200"/>
+                      <a:ext cx="5029200" cy="2803525"/>
                     </a:xfrm>
                     <a:prstGeom prst="rect"/>
                   </pic:spPr>
@@ -2214,7 +2214,131 @@
           <w:color w:val="505050"/>
           <w:sz w:val="20"/>
         </w:rPr>
-        <w:t>Halaman laporan admin dengan filter kampanye, ringkasan anggaran, tabel realisasi, dan fitur Export PDF menggunakan PDFKit.</w:t>
+        <w:t>Halaman Manajemen Kampanye menampilkan tabel campaign dengan kolom: Nama, ID, Platform, Durasi, Total Anggaran, Aksi (Edit/Hapus). Endpoint CRUD diproteksi token (TC-06 s/d TC-10).</w:t>
+      </w:r>
+    </w:p>
+    <w:p/>
+    <w:p>
+      <w:r>
+        <w:rPr>
+          <w:b/>
+          <w:color w:val="1F3864"/>
+          <w:sz w:val="22"/>
+        </w:rPr>
+        <w:t>Screenshot 6 – Halaman Laporan Anggaran Iklan</w:t>
+      </w:r>
+    </w:p>
+    <w:p>
+      <w:pPr>
+        <w:jc w:val="center"/>
+      </w:pPr>
+      <w:r>
+        <w:drawing>
+          <wp:inline xmlns:a="http://schemas.openxmlformats.org/drawingml/2006/main" xmlns:pic="http://schemas.openxmlformats.org/drawingml/2006/picture">
+            <wp:extent cx="5029200" cy="2803525"/>
+            <wp:docPr id="6" name="Picture 6"/>
+            <wp:cNvGraphicFramePr>
+              <a:graphicFrameLocks noChangeAspect="1"/>
+            </wp:cNvGraphicFramePr>
+            <a:graphic>
+              <a:graphicData uri="http://schemas.openxmlformats.org/drawingml/2006/picture">
+                <pic:pic>
+                  <pic:nvPicPr>
+                    <pic:cNvPr id="0" name="real_ss5_laporan.png"/>
+                    <pic:cNvPicPr/>
+                  </pic:nvPicPr>
+                  <pic:blipFill>
+                    <a:blip r:embed="rId14"/>
+                    <a:stretch>
+                      <a:fillRect/>
+                    </a:stretch>
+                  </pic:blipFill>
+                  <pic:spPr>
+                    <a:xfrm>
+                      <a:off x="0" y="0"/>
+                      <a:ext cx="5029200" cy="2803525"/>
+                    </a:xfrm>
+                    <a:prstGeom prst="rect"/>
+                  </pic:spPr>
+                </pic:pic>
+              </a:graphicData>
+            </a:graphic>
+          </wp:inline>
+        </w:drawing>
+      </w:r>
+    </w:p>
+    <w:p>
+      <w:pPr>
+        <w:ind w:left="283"/>
+      </w:pPr>
+      <w:r>
+        <w:rPr>
+          <w:color w:val="505050"/>
+          <w:sz w:val="20"/>
+        </w:rPr>
+        <w:t>Halaman Laporan menampilkan: Total Budget vs Realisasi (79%), Total Revenue IDR 3.4Jt, ROI 25%, ROAS 1.3x, grafik Tren Revenue vs Biaya, dan Performa antar Platform.</w:t>
+      </w:r>
+    </w:p>
+    <w:p/>
+    <w:p>
+      <w:r>
+        <w:rPr>
+          <w:b/>
+          <w:color w:val="1F3864"/>
+          <w:sz w:val="22"/>
+        </w:rPr>
+        <w:t>Screenshot 7 – Halaman Login Pengguna (Operator)</w:t>
+      </w:r>
+    </w:p>
+    <w:p>
+      <w:pPr>
+        <w:jc w:val="center"/>
+      </w:pPr>
+      <w:r>
+        <w:drawing>
+          <wp:inline xmlns:a="http://schemas.openxmlformats.org/drawingml/2006/main" xmlns:pic="http://schemas.openxmlformats.org/drawingml/2006/picture">
+            <wp:extent cx="5029200" cy="2803525"/>
+            <wp:docPr id="7" name="Picture 7"/>
+            <wp:cNvGraphicFramePr>
+              <a:graphicFrameLocks noChangeAspect="1"/>
+            </wp:cNvGraphicFramePr>
+            <a:graphic>
+              <a:graphicData uri="http://schemas.openxmlformats.org/drawingml/2006/picture">
+                <pic:pic>
+                  <pic:nvPicPr>
+                    <pic:cNvPr id="0" name="real_ss6_user_login.png"/>
+                    <pic:cNvPicPr/>
+                  </pic:nvPicPr>
+                  <pic:blipFill>
+                    <a:blip r:embed="rId15"/>
+                    <a:stretch>
+                      <a:fillRect/>
+                    </a:stretch>
+                  </pic:blipFill>
+                  <pic:spPr>
+                    <a:xfrm>
+                      <a:off x="0" y="0"/>
+                      <a:ext cx="5029200" cy="2803525"/>
+                    </a:xfrm>
+                    <a:prstGeom prst="rect"/>
+                  </pic:spPr>
+                </pic:pic>
+              </a:graphicData>
+            </a:graphic>
+          </wp:inline>
+        </w:drawing>
+      </w:r>
+    </w:p>
+    <w:p>
+      <w:pPr>
+        <w:ind w:left="283"/>
+      </w:pPr>
+      <w:r>
+        <w:rPr>
+          <w:color w:val="505050"/>
+          <w:sz w:val="20"/>
+        </w:rPr>
+        <w:t>Form Login Pengguna/Operator dengan field Email Pengguna dan Kata Sandi. Akses terpisah dari Admin untuk menjaga keamanan hak akses berbasis role (JWT).</w:t>
       </w:r>
     </w:p>
     <w:p/>

</xml_diff>